<commit_message>
docs: fix budget section in final report
Corrected water pump price (980 -> 1,500 บาท, actual cost not the
quoted estimate) and added 12 missing hardware items that were
purchased but never itemized: ESP32 DevKit V1, SHT35, LCD I2C, Expansion
Board HW-777, Buzzer, PSU S-120-12, misting nozzles/tubing, 3x IP65
enclosures, the 220V exhaust fan, a second boost converter (150W),
XL4005, and jumper wires. Total goes from 1,705.00 to 10,500.50 บาท.

Reworded the summary line and the stale caveat paragraph that used to
list these exact items as "not yet included" — they are now. Still
excluded: wiring labor (no recorded price).
</commit_message>
<xml_diff>
--- a/docs/reports/รายงานฉบับสมบูรณ์ - Greenhouse IoT Smart Farm.docx
+++ b/docs/reports/รายงานฉบับสมบูรณ์ - Greenhouse IoT Smart Farm.docx
@@ -7037,7 +7037,7 @@
                 <w:sz w:val="21"/>
                 <w:szCs w:val="21"/>
               </w:rPr>
-              <w:t xml:space="preserve">980.00</w:t>
+              <w:t xml:space="preserve">1,500.00</w:t>
             </w:r>
           </w:p>
         </w:tc>
@@ -7061,7 +7061,7 @@
                 <w:sz w:val="21"/>
                 <w:szCs w:val="21"/>
               </w:rPr>
-              <w:t xml:space="preserve">980.00</w:t>
+              <w:t xml:space="preserve">1,500.00</w:t>
             </w:r>
           </w:p>
         </w:tc>
@@ -7160,6 +7160,1182 @@
                 <w:szCs w:val="21"/>
               </w:rPr>
               <w:t xml:space="preserve">130.00</w:t>
+            </w:r>
+          </w:p>
+        </w:tc>
+      </w:tr>
+      <w:tr>
+        <w:tc>
+          <w:tcPr>
+            <w:tcW w:type="dxa" w:w="4426"/>
+            <w:tcMar>
+              <w:top w:type="dxa" w:w="70"/>
+              <w:left w:type="dxa" w:w="100"/>
+              <w:bottom w:type="dxa" w:w="70"/>
+              <w:right w:type="dxa" w:w="100"/>
+            </w:tcMar>
+          </w:tcPr>
+          <w:p>
+            <w:pPr>
+              <w:spacing w:after="20"/>
+            </w:pPr>
+            <w:r>
+              <w:rPr>
+                <w:rFonts w:ascii="TH Sarabun New" w:cs="TH Sarabun New" w:eastAsia="TH Sarabun New" w:hAnsi="TH Sarabun New"/>
+                <w:sz w:val="21"/>
+                <w:szCs w:val="21"/>
+              </w:rPr>
+              <w:t xml:space="preserve">ESP32 DevKit V1</w:t>
+            </w:r>
+          </w:p>
+        </w:tc>
+        <w:tc>
+          <w:tcPr>
+            <w:tcW w:type="dxa" w:w="1000"/>
+            <w:tcMar>
+              <w:top w:type="dxa" w:w="70"/>
+              <w:left w:type="dxa" w:w="100"/>
+              <w:bottom w:type="dxa" w:w="70"/>
+              <w:right w:type="dxa" w:w="100"/>
+            </w:tcMar>
+          </w:tcPr>
+          <w:p>
+            <w:pPr>
+              <w:spacing w:after="20"/>
+            </w:pPr>
+            <w:r>
+              <w:rPr>
+                <w:rFonts w:ascii="TH Sarabun New" w:cs="TH Sarabun New" w:eastAsia="TH Sarabun New" w:hAnsi="TH Sarabun New"/>
+                <w:sz w:val="21"/>
+                <w:szCs w:val="21"/>
+              </w:rPr>
+              <w:t xml:space="preserve">1</w:t>
+            </w:r>
+          </w:p>
+        </w:tc>
+        <w:tc>
+          <w:tcPr>
+            <w:tcW w:type="dxa" w:w="1800"/>
+            <w:tcMar>
+              <w:top w:type="dxa" w:w="70"/>
+              <w:left w:type="dxa" w:w="100"/>
+              <w:bottom w:type="dxa" w:w="70"/>
+              <w:right w:type="dxa" w:w="100"/>
+            </w:tcMar>
+          </w:tcPr>
+          <w:p>
+            <w:pPr>
+              <w:spacing w:after="20"/>
+            </w:pPr>
+            <w:r>
+              <w:rPr>
+                <w:rFonts w:ascii="TH Sarabun New" w:cs="TH Sarabun New" w:eastAsia="TH Sarabun New" w:hAnsi="TH Sarabun New"/>
+                <w:sz w:val="21"/>
+                <w:szCs w:val="21"/>
+              </w:rPr>
+              <w:t xml:space="preserve">200.00</w:t>
+            </w:r>
+          </w:p>
+        </w:tc>
+        <w:tc>
+          <w:tcPr>
+            <w:tcW w:type="dxa" w:w="1800"/>
+            <w:tcMar>
+              <w:top w:type="dxa" w:w="70"/>
+              <w:left w:type="dxa" w:w="100"/>
+              <w:bottom w:type="dxa" w:w="70"/>
+              <w:right w:type="dxa" w:w="100"/>
+            </w:tcMar>
+          </w:tcPr>
+          <w:p>
+            <w:pPr>
+              <w:spacing w:after="20"/>
+            </w:pPr>
+            <w:r>
+              <w:rPr>
+                <w:rFonts w:ascii="TH Sarabun New" w:cs="TH Sarabun New" w:eastAsia="TH Sarabun New" w:hAnsi="TH Sarabun New"/>
+                <w:sz w:val="21"/>
+                <w:szCs w:val="21"/>
+              </w:rPr>
+              <w:t xml:space="preserve">200.00</w:t>
+            </w:r>
+          </w:p>
+        </w:tc>
+      </w:tr>
+      <w:tr>
+        <w:tc>
+          <w:tcPr>
+            <w:tcW w:type="dxa" w:w="4426"/>
+            <w:tcMar>
+              <w:top w:type="dxa" w:w="70"/>
+              <w:left w:type="dxa" w:w="100"/>
+              <w:bottom w:type="dxa" w:w="70"/>
+              <w:right w:type="dxa" w:w="100"/>
+            </w:tcMar>
+          </w:tcPr>
+          <w:p>
+            <w:pPr>
+              <w:spacing w:after="20"/>
+            </w:pPr>
+            <w:r>
+              <w:rPr>
+                <w:rFonts w:ascii="TH Sarabun New" w:cs="TH Sarabun New" w:eastAsia="TH Sarabun New" w:hAnsi="TH Sarabun New"/>
+                <w:sz w:val="21"/>
+                <w:szCs w:val="21"/>
+              </w:rPr>
+              <w:t xml:space="preserve">SHT35</w:t>
+            </w:r>
+          </w:p>
+        </w:tc>
+        <w:tc>
+          <w:tcPr>
+            <w:tcW w:type="dxa" w:w="1000"/>
+            <w:tcMar>
+              <w:top w:type="dxa" w:w="70"/>
+              <w:left w:type="dxa" w:w="100"/>
+              <w:bottom w:type="dxa" w:w="70"/>
+              <w:right w:type="dxa" w:w="100"/>
+            </w:tcMar>
+          </w:tcPr>
+          <w:p>
+            <w:pPr>
+              <w:spacing w:after="20"/>
+            </w:pPr>
+            <w:r>
+              <w:rPr>
+                <w:rFonts w:ascii="TH Sarabun New" w:cs="TH Sarabun New" w:eastAsia="TH Sarabun New" w:hAnsi="TH Sarabun New"/>
+                <w:sz w:val="21"/>
+                <w:szCs w:val="21"/>
+              </w:rPr>
+              <w:t xml:space="preserve">1</w:t>
+            </w:r>
+          </w:p>
+        </w:tc>
+        <w:tc>
+          <w:tcPr>
+            <w:tcW w:type="dxa" w:w="1800"/>
+            <w:tcMar>
+              <w:top w:type="dxa" w:w="70"/>
+              <w:left w:type="dxa" w:w="100"/>
+              <w:bottom w:type="dxa" w:w="70"/>
+              <w:right w:type="dxa" w:w="100"/>
+            </w:tcMar>
+          </w:tcPr>
+          <w:p>
+            <w:pPr>
+              <w:spacing w:after="20"/>
+            </w:pPr>
+            <w:r>
+              <w:rPr>
+                <w:rFonts w:ascii="TH Sarabun New" w:cs="TH Sarabun New" w:eastAsia="TH Sarabun New" w:hAnsi="TH Sarabun New"/>
+                <w:sz w:val="21"/>
+                <w:szCs w:val="21"/>
+              </w:rPr>
+              <w:t xml:space="preserve">350.00</w:t>
+            </w:r>
+          </w:p>
+        </w:tc>
+        <w:tc>
+          <w:tcPr>
+            <w:tcW w:type="dxa" w:w="1800"/>
+            <w:tcMar>
+              <w:top w:type="dxa" w:w="70"/>
+              <w:left w:type="dxa" w:w="100"/>
+              <w:bottom w:type="dxa" w:w="70"/>
+              <w:right w:type="dxa" w:w="100"/>
+            </w:tcMar>
+          </w:tcPr>
+          <w:p>
+            <w:pPr>
+              <w:spacing w:after="20"/>
+            </w:pPr>
+            <w:r>
+              <w:rPr>
+                <w:rFonts w:ascii="TH Sarabun New" w:cs="TH Sarabun New" w:eastAsia="TH Sarabun New" w:hAnsi="TH Sarabun New"/>
+                <w:sz w:val="21"/>
+                <w:szCs w:val="21"/>
+              </w:rPr>
+              <w:t xml:space="preserve">350.00</w:t>
+            </w:r>
+          </w:p>
+        </w:tc>
+      </w:tr>
+      <w:tr>
+        <w:tc>
+          <w:tcPr>
+            <w:tcW w:type="dxa" w:w="4426"/>
+            <w:tcMar>
+              <w:top w:type="dxa" w:w="70"/>
+              <w:left w:type="dxa" w:w="100"/>
+              <w:bottom w:type="dxa" w:w="70"/>
+              <w:right w:type="dxa" w:w="100"/>
+            </w:tcMar>
+          </w:tcPr>
+          <w:p>
+            <w:pPr>
+              <w:spacing w:after="20"/>
+            </w:pPr>
+            <w:r>
+              <w:rPr>
+                <w:rFonts w:ascii="TH Sarabun New" w:cs="TH Sarabun New" w:eastAsia="TH Sarabun New" w:hAnsi="TH Sarabun New"/>
+                <w:sz w:val="21"/>
+                <w:szCs w:val="21"/>
+              </w:rPr>
+              <w:t xml:space="preserve">LCD I2C 16×2</w:t>
+            </w:r>
+          </w:p>
+        </w:tc>
+        <w:tc>
+          <w:tcPr>
+            <w:tcW w:type="dxa" w:w="1000"/>
+            <w:tcMar>
+              <w:top w:type="dxa" w:w="70"/>
+              <w:left w:type="dxa" w:w="100"/>
+              <w:bottom w:type="dxa" w:w="70"/>
+              <w:right w:type="dxa" w:w="100"/>
+            </w:tcMar>
+          </w:tcPr>
+          <w:p>
+            <w:pPr>
+              <w:spacing w:after="20"/>
+            </w:pPr>
+            <w:r>
+              <w:rPr>
+                <w:rFonts w:ascii="TH Sarabun New" w:cs="TH Sarabun New" w:eastAsia="TH Sarabun New" w:hAnsi="TH Sarabun New"/>
+                <w:sz w:val="21"/>
+                <w:szCs w:val="21"/>
+              </w:rPr>
+              <w:t xml:space="preserve">1</w:t>
+            </w:r>
+          </w:p>
+        </w:tc>
+        <w:tc>
+          <w:tcPr>
+            <w:tcW w:type="dxa" w:w="1800"/>
+            <w:tcMar>
+              <w:top w:type="dxa" w:w="70"/>
+              <w:left w:type="dxa" w:w="100"/>
+              <w:bottom w:type="dxa" w:w="70"/>
+              <w:right w:type="dxa" w:w="100"/>
+            </w:tcMar>
+          </w:tcPr>
+          <w:p>
+            <w:pPr>
+              <w:spacing w:after="20"/>
+            </w:pPr>
+            <w:r>
+              <w:rPr>
+                <w:rFonts w:ascii="TH Sarabun New" w:cs="TH Sarabun New" w:eastAsia="TH Sarabun New" w:hAnsi="TH Sarabun New"/>
+                <w:sz w:val="21"/>
+                <w:szCs w:val="21"/>
+              </w:rPr>
+              <w:t xml:space="preserve">120.50</w:t>
+            </w:r>
+          </w:p>
+        </w:tc>
+        <w:tc>
+          <w:tcPr>
+            <w:tcW w:type="dxa" w:w="1800"/>
+            <w:tcMar>
+              <w:top w:type="dxa" w:w="70"/>
+              <w:left w:type="dxa" w:w="100"/>
+              <w:bottom w:type="dxa" w:w="70"/>
+              <w:right w:type="dxa" w:w="100"/>
+            </w:tcMar>
+          </w:tcPr>
+          <w:p>
+            <w:pPr>
+              <w:spacing w:after="20"/>
+            </w:pPr>
+            <w:r>
+              <w:rPr>
+                <w:rFonts w:ascii="TH Sarabun New" w:cs="TH Sarabun New" w:eastAsia="TH Sarabun New" w:hAnsi="TH Sarabun New"/>
+                <w:sz w:val="21"/>
+                <w:szCs w:val="21"/>
+              </w:rPr>
+              <w:t xml:space="preserve">120.50</w:t>
+            </w:r>
+          </w:p>
+        </w:tc>
+      </w:tr>
+      <w:tr>
+        <w:tc>
+          <w:tcPr>
+            <w:tcW w:type="dxa" w:w="4426"/>
+            <w:tcMar>
+              <w:top w:type="dxa" w:w="70"/>
+              <w:left w:type="dxa" w:w="100"/>
+              <w:bottom w:type="dxa" w:w="70"/>
+              <w:right w:type="dxa" w:w="100"/>
+            </w:tcMar>
+          </w:tcPr>
+          <w:p>
+            <w:pPr>
+              <w:spacing w:after="20"/>
+            </w:pPr>
+            <w:r>
+              <w:rPr>
+                <w:rFonts w:ascii="TH Sarabun New" w:cs="TH Sarabun New" w:eastAsia="TH Sarabun New" w:hAnsi="TH Sarabun New"/>
+                <w:sz w:val="21"/>
+                <w:szCs w:val="21"/>
+              </w:rPr>
+              <w:t xml:space="preserve">Expansion Board HW-777</w:t>
+            </w:r>
+          </w:p>
+        </w:tc>
+        <w:tc>
+          <w:tcPr>
+            <w:tcW w:type="dxa" w:w="1000"/>
+            <w:tcMar>
+              <w:top w:type="dxa" w:w="70"/>
+              <w:left w:type="dxa" w:w="100"/>
+              <w:bottom w:type="dxa" w:w="70"/>
+              <w:right w:type="dxa" w:w="100"/>
+            </w:tcMar>
+          </w:tcPr>
+          <w:p>
+            <w:pPr>
+              <w:spacing w:after="20"/>
+            </w:pPr>
+            <w:r>
+              <w:rPr>
+                <w:rFonts w:ascii="TH Sarabun New" w:cs="TH Sarabun New" w:eastAsia="TH Sarabun New" w:hAnsi="TH Sarabun New"/>
+                <w:sz w:val="21"/>
+                <w:szCs w:val="21"/>
+              </w:rPr>
+              <w:t xml:space="preserve">1</w:t>
+            </w:r>
+          </w:p>
+        </w:tc>
+        <w:tc>
+          <w:tcPr>
+            <w:tcW w:type="dxa" w:w="1800"/>
+            <w:tcMar>
+              <w:top w:type="dxa" w:w="70"/>
+              <w:left w:type="dxa" w:w="100"/>
+              <w:bottom w:type="dxa" w:w="70"/>
+              <w:right w:type="dxa" w:w="100"/>
+            </w:tcMar>
+          </w:tcPr>
+          <w:p>
+            <w:pPr>
+              <w:spacing w:after="20"/>
+            </w:pPr>
+            <w:r>
+              <w:rPr>
+                <w:rFonts w:ascii="TH Sarabun New" w:cs="TH Sarabun New" w:eastAsia="TH Sarabun New" w:hAnsi="TH Sarabun New"/>
+                <w:sz w:val="21"/>
+                <w:szCs w:val="21"/>
+              </w:rPr>
+              <w:t xml:space="preserve">50.00</w:t>
+            </w:r>
+          </w:p>
+        </w:tc>
+        <w:tc>
+          <w:tcPr>
+            <w:tcW w:type="dxa" w:w="1800"/>
+            <w:tcMar>
+              <w:top w:type="dxa" w:w="70"/>
+              <w:left w:type="dxa" w:w="100"/>
+              <w:bottom w:type="dxa" w:w="70"/>
+              <w:right w:type="dxa" w:w="100"/>
+            </w:tcMar>
+          </w:tcPr>
+          <w:p>
+            <w:pPr>
+              <w:spacing w:after="20"/>
+            </w:pPr>
+            <w:r>
+              <w:rPr>
+                <w:rFonts w:ascii="TH Sarabun New" w:cs="TH Sarabun New" w:eastAsia="TH Sarabun New" w:hAnsi="TH Sarabun New"/>
+                <w:sz w:val="21"/>
+                <w:szCs w:val="21"/>
+              </w:rPr>
+              <w:t xml:space="preserve">50.00</w:t>
+            </w:r>
+          </w:p>
+        </w:tc>
+      </w:tr>
+      <w:tr>
+        <w:tc>
+          <w:tcPr>
+            <w:tcW w:type="dxa" w:w="4426"/>
+            <w:tcMar>
+              <w:top w:type="dxa" w:w="70"/>
+              <w:left w:type="dxa" w:w="100"/>
+              <w:bottom w:type="dxa" w:w="70"/>
+              <w:right w:type="dxa" w:w="100"/>
+            </w:tcMar>
+          </w:tcPr>
+          <w:p>
+            <w:pPr>
+              <w:spacing w:after="20"/>
+            </w:pPr>
+            <w:r>
+              <w:rPr>
+                <w:rFonts w:ascii="TH Sarabun New" w:cs="TH Sarabun New" w:eastAsia="TH Sarabun New" w:hAnsi="TH Sarabun New"/>
+                <w:sz w:val="21"/>
+                <w:szCs w:val="21"/>
+              </w:rPr>
+              <w:t xml:space="preserve">Buzzer Module</w:t>
+            </w:r>
+          </w:p>
+        </w:tc>
+        <w:tc>
+          <w:tcPr>
+            <w:tcW w:type="dxa" w:w="1000"/>
+            <w:tcMar>
+              <w:top w:type="dxa" w:w="70"/>
+              <w:left w:type="dxa" w:w="100"/>
+              <w:bottom w:type="dxa" w:w="70"/>
+              <w:right w:type="dxa" w:w="100"/>
+            </w:tcMar>
+          </w:tcPr>
+          <w:p>
+            <w:pPr>
+              <w:spacing w:after="20"/>
+            </w:pPr>
+            <w:r>
+              <w:rPr>
+                <w:rFonts w:ascii="TH Sarabun New" w:cs="TH Sarabun New" w:eastAsia="TH Sarabun New" w:hAnsi="TH Sarabun New"/>
+                <w:sz w:val="21"/>
+                <w:szCs w:val="21"/>
+              </w:rPr>
+              <w:t xml:space="preserve">1</w:t>
+            </w:r>
+          </w:p>
+        </w:tc>
+        <w:tc>
+          <w:tcPr>
+            <w:tcW w:type="dxa" w:w="1800"/>
+            <w:tcMar>
+              <w:top w:type="dxa" w:w="70"/>
+              <w:left w:type="dxa" w:w="100"/>
+              <w:bottom w:type="dxa" w:w="70"/>
+              <w:right w:type="dxa" w:w="100"/>
+            </w:tcMar>
+          </w:tcPr>
+          <w:p>
+            <w:pPr>
+              <w:spacing w:after="20"/>
+            </w:pPr>
+            <w:r>
+              <w:rPr>
+                <w:rFonts w:ascii="TH Sarabun New" w:cs="TH Sarabun New" w:eastAsia="TH Sarabun New" w:hAnsi="TH Sarabun New"/>
+                <w:sz w:val="21"/>
+                <w:szCs w:val="21"/>
+              </w:rPr>
+              <w:t xml:space="preserve">10.00</w:t>
+            </w:r>
+          </w:p>
+        </w:tc>
+        <w:tc>
+          <w:tcPr>
+            <w:tcW w:type="dxa" w:w="1800"/>
+            <w:tcMar>
+              <w:top w:type="dxa" w:w="70"/>
+              <w:left w:type="dxa" w:w="100"/>
+              <w:bottom w:type="dxa" w:w="70"/>
+              <w:right w:type="dxa" w:w="100"/>
+            </w:tcMar>
+          </w:tcPr>
+          <w:p>
+            <w:pPr>
+              <w:spacing w:after="20"/>
+            </w:pPr>
+            <w:r>
+              <w:rPr>
+                <w:rFonts w:ascii="TH Sarabun New" w:cs="TH Sarabun New" w:eastAsia="TH Sarabun New" w:hAnsi="TH Sarabun New"/>
+                <w:sz w:val="21"/>
+                <w:szCs w:val="21"/>
+              </w:rPr>
+              <w:t xml:space="preserve">10.00</w:t>
+            </w:r>
+          </w:p>
+        </w:tc>
+      </w:tr>
+      <w:tr>
+        <w:tc>
+          <w:tcPr>
+            <w:tcW w:type="dxa" w:w="4426"/>
+            <w:tcMar>
+              <w:top w:type="dxa" w:w="70"/>
+              <w:left w:type="dxa" w:w="100"/>
+              <w:bottom w:type="dxa" w:w="70"/>
+              <w:right w:type="dxa" w:w="100"/>
+            </w:tcMar>
+          </w:tcPr>
+          <w:p>
+            <w:pPr>
+              <w:spacing w:after="20"/>
+            </w:pPr>
+            <w:r>
+              <w:rPr>
+                <w:rFonts w:ascii="TH Sarabun New" w:cs="TH Sarabun New" w:eastAsia="TH Sarabun New" w:hAnsi="TH Sarabun New"/>
+                <w:sz w:val="21"/>
+                <w:szCs w:val="21"/>
+              </w:rPr>
+              <w:t xml:space="preserve">PSU S-120-12 (12V 10A)</w:t>
+            </w:r>
+          </w:p>
+        </w:tc>
+        <w:tc>
+          <w:tcPr>
+            <w:tcW w:type="dxa" w:w="1000"/>
+            <w:tcMar>
+              <w:top w:type="dxa" w:w="70"/>
+              <w:left w:type="dxa" w:w="100"/>
+              <w:bottom w:type="dxa" w:w="70"/>
+              <w:right w:type="dxa" w:w="100"/>
+            </w:tcMar>
+          </w:tcPr>
+          <w:p>
+            <w:pPr>
+              <w:spacing w:after="20"/>
+            </w:pPr>
+            <w:r>
+              <w:rPr>
+                <w:rFonts w:ascii="TH Sarabun New" w:cs="TH Sarabun New" w:eastAsia="TH Sarabun New" w:hAnsi="TH Sarabun New"/>
+                <w:sz w:val="21"/>
+                <w:szCs w:val="21"/>
+              </w:rPr>
+              <w:t xml:space="preserve">1</w:t>
+            </w:r>
+          </w:p>
+        </w:tc>
+        <w:tc>
+          <w:tcPr>
+            <w:tcW w:type="dxa" w:w="1800"/>
+            <w:tcMar>
+              <w:top w:type="dxa" w:w="70"/>
+              <w:left w:type="dxa" w:w="100"/>
+              <w:bottom w:type="dxa" w:w="70"/>
+              <w:right w:type="dxa" w:w="100"/>
+            </w:tcMar>
+          </w:tcPr>
+          <w:p>
+            <w:pPr>
+              <w:spacing w:after="20"/>
+            </w:pPr>
+            <w:r>
+              <w:rPr>
+                <w:rFonts w:ascii="TH Sarabun New" w:cs="TH Sarabun New" w:eastAsia="TH Sarabun New" w:hAnsi="TH Sarabun New"/>
+                <w:sz w:val="21"/>
+                <w:szCs w:val="21"/>
+              </w:rPr>
+              <w:t xml:space="preserve">440.00</w:t>
+            </w:r>
+          </w:p>
+        </w:tc>
+        <w:tc>
+          <w:tcPr>
+            <w:tcW w:type="dxa" w:w="1800"/>
+            <w:tcMar>
+              <w:top w:type="dxa" w:w="70"/>
+              <w:left w:type="dxa" w:w="100"/>
+              <w:bottom w:type="dxa" w:w="70"/>
+              <w:right w:type="dxa" w:w="100"/>
+            </w:tcMar>
+          </w:tcPr>
+          <w:p>
+            <w:pPr>
+              <w:spacing w:after="20"/>
+            </w:pPr>
+            <w:r>
+              <w:rPr>
+                <w:rFonts w:ascii="TH Sarabun New" w:cs="TH Sarabun New" w:eastAsia="TH Sarabun New" w:hAnsi="TH Sarabun New"/>
+                <w:sz w:val="21"/>
+                <w:szCs w:val="21"/>
+              </w:rPr>
+              <w:t xml:space="preserve">440.00</w:t>
+            </w:r>
+          </w:p>
+        </w:tc>
+      </w:tr>
+      <w:tr>
+        <w:tc>
+          <w:tcPr>
+            <w:tcW w:type="dxa" w:w="4426"/>
+            <w:tcMar>
+              <w:top w:type="dxa" w:w="70"/>
+              <w:left w:type="dxa" w:w="100"/>
+              <w:bottom w:type="dxa" w:w="70"/>
+              <w:right w:type="dxa" w:w="100"/>
+            </w:tcMar>
+          </w:tcPr>
+          <w:p>
+            <w:pPr>
+              <w:spacing w:after="20"/>
+            </w:pPr>
+            <w:r>
+              <w:rPr>
+                <w:rFonts w:ascii="TH Sarabun New" w:cs="TH Sarabun New" w:eastAsia="TH Sarabun New" w:hAnsi="TH Sarabun New"/>
+                <w:sz w:val="21"/>
+                <w:szCs w:val="21"/>
+              </w:rPr>
+              <w:t xml:space="preserve">หัวพ่นหมอก + สายยาง</w:t>
+            </w:r>
+          </w:p>
+        </w:tc>
+        <w:tc>
+          <w:tcPr>
+            <w:tcW w:type="dxa" w:w="1000"/>
+            <w:tcMar>
+              <w:top w:type="dxa" w:w="70"/>
+              <w:left w:type="dxa" w:w="100"/>
+              <w:bottom w:type="dxa" w:w="70"/>
+              <w:right w:type="dxa" w:w="100"/>
+            </w:tcMar>
+          </w:tcPr>
+          <w:p>
+            <w:pPr>
+              <w:spacing w:after="20"/>
+            </w:pPr>
+            <w:r>
+              <w:rPr>
+                <w:rFonts w:ascii="TH Sarabun New" w:cs="TH Sarabun New" w:eastAsia="TH Sarabun New" w:hAnsi="TH Sarabun New"/>
+                <w:sz w:val="21"/>
+                <w:szCs w:val="21"/>
+              </w:rPr>
+              <w:t xml:space="preserve">1</w:t>
+            </w:r>
+          </w:p>
+        </w:tc>
+        <w:tc>
+          <w:tcPr>
+            <w:tcW w:type="dxa" w:w="1800"/>
+            <w:tcMar>
+              <w:top w:type="dxa" w:w="70"/>
+              <w:left w:type="dxa" w:w="100"/>
+              <w:bottom w:type="dxa" w:w="70"/>
+              <w:right w:type="dxa" w:w="100"/>
+            </w:tcMar>
+          </w:tcPr>
+          <w:p>
+            <w:pPr>
+              <w:spacing w:after="20"/>
+            </w:pPr>
+            <w:r>
+              <w:rPr>
+                <w:rFonts w:ascii="TH Sarabun New" w:cs="TH Sarabun New" w:eastAsia="TH Sarabun New" w:hAnsi="TH Sarabun New"/>
+                <w:sz w:val="21"/>
+                <w:szCs w:val="21"/>
+              </w:rPr>
+              <w:t xml:space="preserve">1,000.00</w:t>
+            </w:r>
+          </w:p>
+        </w:tc>
+        <w:tc>
+          <w:tcPr>
+            <w:tcW w:type="dxa" w:w="1800"/>
+            <w:tcMar>
+              <w:top w:type="dxa" w:w="70"/>
+              <w:left w:type="dxa" w:w="100"/>
+              <w:bottom w:type="dxa" w:w="70"/>
+              <w:right w:type="dxa" w:w="100"/>
+            </w:tcMar>
+          </w:tcPr>
+          <w:p>
+            <w:pPr>
+              <w:spacing w:after="20"/>
+            </w:pPr>
+            <w:r>
+              <w:rPr>
+                <w:rFonts w:ascii="TH Sarabun New" w:cs="TH Sarabun New" w:eastAsia="TH Sarabun New" w:hAnsi="TH Sarabun New"/>
+                <w:sz w:val="21"/>
+                <w:szCs w:val="21"/>
+              </w:rPr>
+              <w:t xml:space="preserve">1,000.00</w:t>
+            </w:r>
+          </w:p>
+        </w:tc>
+      </w:tr>
+      <w:tr>
+        <w:tc>
+          <w:tcPr>
+            <w:tcW w:type="dxa" w:w="4426"/>
+            <w:tcMar>
+              <w:top w:type="dxa" w:w="70"/>
+              <w:left w:type="dxa" w:w="100"/>
+              <w:bottom w:type="dxa" w:w="70"/>
+              <w:right w:type="dxa" w:w="100"/>
+            </w:tcMar>
+          </w:tcPr>
+          <w:p>
+            <w:pPr>
+              <w:spacing w:after="20"/>
+            </w:pPr>
+            <w:r>
+              <w:rPr>
+                <w:rFonts w:ascii="TH Sarabun New" w:cs="TH Sarabun New" w:eastAsia="TH Sarabun New" w:hAnsi="TH Sarabun New"/>
+                <w:sz w:val="21"/>
+                <w:szCs w:val="21"/>
+              </w:rPr>
+              <w:t xml:space="preserve">กล่องกันน้ำ IP65</w:t>
+            </w:r>
+          </w:p>
+        </w:tc>
+        <w:tc>
+          <w:tcPr>
+            <w:tcW w:type="dxa" w:w="1000"/>
+            <w:tcMar>
+              <w:top w:type="dxa" w:w="70"/>
+              <w:left w:type="dxa" w:w="100"/>
+              <w:bottom w:type="dxa" w:w="70"/>
+              <w:right w:type="dxa" w:w="100"/>
+            </w:tcMar>
+          </w:tcPr>
+          <w:p>
+            <w:pPr>
+              <w:spacing w:after="20"/>
+            </w:pPr>
+            <w:r>
+              <w:rPr>
+                <w:rFonts w:ascii="TH Sarabun New" w:cs="TH Sarabun New" w:eastAsia="TH Sarabun New" w:hAnsi="TH Sarabun New"/>
+                <w:sz w:val="21"/>
+                <w:szCs w:val="21"/>
+              </w:rPr>
+              <w:t xml:space="preserve">3</w:t>
+            </w:r>
+          </w:p>
+        </w:tc>
+        <w:tc>
+          <w:tcPr>
+            <w:tcW w:type="dxa" w:w="1800"/>
+            <w:tcMar>
+              <w:top w:type="dxa" w:w="70"/>
+              <w:left w:type="dxa" w:w="100"/>
+              <w:bottom w:type="dxa" w:w="70"/>
+              <w:right w:type="dxa" w:w="100"/>
+            </w:tcMar>
+          </w:tcPr>
+          <w:p>
+            <w:pPr>
+              <w:spacing w:after="20"/>
+            </w:pPr>
+            <w:r>
+              <w:rPr>
+                <w:rFonts w:ascii="TH Sarabun New" w:cs="TH Sarabun New" w:eastAsia="TH Sarabun New" w:hAnsi="TH Sarabun New"/>
+                <w:sz w:val="21"/>
+                <w:szCs w:val="21"/>
+              </w:rPr>
+              <w:t xml:space="preserve">350.00</w:t>
+            </w:r>
+          </w:p>
+        </w:tc>
+        <w:tc>
+          <w:tcPr>
+            <w:tcW w:type="dxa" w:w="1800"/>
+            <w:tcMar>
+              <w:top w:type="dxa" w:w="70"/>
+              <w:left w:type="dxa" w:w="100"/>
+              <w:bottom w:type="dxa" w:w="70"/>
+              <w:right w:type="dxa" w:w="100"/>
+            </w:tcMar>
+          </w:tcPr>
+          <w:p>
+            <w:pPr>
+              <w:spacing w:after="20"/>
+            </w:pPr>
+            <w:r>
+              <w:rPr>
+                <w:rFonts w:ascii="TH Sarabun New" w:cs="TH Sarabun New" w:eastAsia="TH Sarabun New" w:hAnsi="TH Sarabun New"/>
+                <w:sz w:val="21"/>
+                <w:szCs w:val="21"/>
+              </w:rPr>
+              <w:t xml:space="preserve">1,050.00</w:t>
+            </w:r>
+          </w:p>
+        </w:tc>
+      </w:tr>
+      <w:tr>
+        <w:tc>
+          <w:tcPr>
+            <w:tcW w:type="dxa" w:w="4426"/>
+            <w:tcMar>
+              <w:top w:type="dxa" w:w="70"/>
+              <w:left w:type="dxa" w:w="100"/>
+              <w:bottom w:type="dxa" w:w="70"/>
+              <w:right w:type="dxa" w:w="100"/>
+            </w:tcMar>
+          </w:tcPr>
+          <w:p>
+            <w:pPr>
+              <w:spacing w:after="20"/>
+            </w:pPr>
+            <w:r>
+              <w:rPr>
+                <w:rFonts w:ascii="TH Sarabun New" w:cs="TH Sarabun New" w:eastAsia="TH Sarabun New" w:hAnsi="TH Sarabun New"/>
+                <w:sz w:val="21"/>
+                <w:szCs w:val="21"/>
+              </w:rPr>
+              <w:t xml:space="preserve">พัดลมระบายอากาศ 220V AC (CH3)</w:t>
+            </w:r>
+          </w:p>
+        </w:tc>
+        <w:tc>
+          <w:tcPr>
+            <w:tcW w:type="dxa" w:w="1000"/>
+            <w:tcMar>
+              <w:top w:type="dxa" w:w="70"/>
+              <w:left w:type="dxa" w:w="100"/>
+              <w:bottom w:type="dxa" w:w="70"/>
+              <w:right w:type="dxa" w:w="100"/>
+            </w:tcMar>
+          </w:tcPr>
+          <w:p>
+            <w:pPr>
+              <w:spacing w:after="20"/>
+            </w:pPr>
+            <w:r>
+              <w:rPr>
+                <w:rFonts w:ascii="TH Sarabun New" w:cs="TH Sarabun New" w:eastAsia="TH Sarabun New" w:hAnsi="TH Sarabun New"/>
+                <w:sz w:val="21"/>
+                <w:szCs w:val="21"/>
+              </w:rPr>
+              <w:t xml:space="preserve">1</w:t>
+            </w:r>
+          </w:p>
+        </w:tc>
+        <w:tc>
+          <w:tcPr>
+            <w:tcW w:type="dxa" w:w="1800"/>
+            <w:tcMar>
+              <w:top w:type="dxa" w:w="70"/>
+              <w:left w:type="dxa" w:w="100"/>
+              <w:bottom w:type="dxa" w:w="70"/>
+              <w:right w:type="dxa" w:w="100"/>
+            </w:tcMar>
+          </w:tcPr>
+          <w:p>
+            <w:pPr>
+              <w:spacing w:after="20"/>
+            </w:pPr>
+            <w:r>
+              <w:rPr>
+                <w:rFonts w:ascii="TH Sarabun New" w:cs="TH Sarabun New" w:eastAsia="TH Sarabun New" w:hAnsi="TH Sarabun New"/>
+                <w:sz w:val="21"/>
+                <w:szCs w:val="21"/>
+              </w:rPr>
+              <w:t xml:space="preserve">4,500.00</w:t>
+            </w:r>
+          </w:p>
+        </w:tc>
+        <w:tc>
+          <w:tcPr>
+            <w:tcW w:type="dxa" w:w="1800"/>
+            <w:tcMar>
+              <w:top w:type="dxa" w:w="70"/>
+              <w:left w:type="dxa" w:w="100"/>
+              <w:bottom w:type="dxa" w:w="70"/>
+              <w:right w:type="dxa" w:w="100"/>
+            </w:tcMar>
+          </w:tcPr>
+          <w:p>
+            <w:pPr>
+              <w:spacing w:after="20"/>
+            </w:pPr>
+            <w:r>
+              <w:rPr>
+                <w:rFonts w:ascii="TH Sarabun New" w:cs="TH Sarabun New" w:eastAsia="TH Sarabun New" w:hAnsi="TH Sarabun New"/>
+                <w:sz w:val="21"/>
+                <w:szCs w:val="21"/>
+              </w:rPr>
+              <w:t xml:space="preserve">4,500.00</w:t>
+            </w:r>
+          </w:p>
+        </w:tc>
+      </w:tr>
+      <w:tr>
+        <w:tc>
+          <w:tcPr>
+            <w:tcW w:type="dxa" w:w="4426"/>
+            <w:tcMar>
+              <w:top w:type="dxa" w:w="70"/>
+              <w:left w:type="dxa" w:w="100"/>
+              <w:bottom w:type="dxa" w:w="70"/>
+              <w:right w:type="dxa" w:w="100"/>
+            </w:tcMar>
+          </w:tcPr>
+          <w:p>
+            <w:pPr>
+              <w:spacing w:after="20"/>
+            </w:pPr>
+            <w:r>
+              <w:rPr>
+                <w:rFonts w:ascii="TH Sarabun New" w:cs="TH Sarabun New" w:eastAsia="TH Sarabun New" w:hAnsi="TH Sarabun New"/>
+                <w:sz w:val="21"/>
+                <w:szCs w:val="21"/>
+              </w:rPr>
+              <w:t xml:space="preserve">Boost Converter DC-DC 150W (10-32V→12-35V, 6A)</w:t>
+            </w:r>
+          </w:p>
+        </w:tc>
+        <w:tc>
+          <w:tcPr>
+            <w:tcW w:type="dxa" w:w="1000"/>
+            <w:tcMar>
+              <w:top w:type="dxa" w:w="70"/>
+              <w:left w:type="dxa" w:w="100"/>
+              <w:bottom w:type="dxa" w:w="70"/>
+              <w:right w:type="dxa" w:w="100"/>
+            </w:tcMar>
+          </w:tcPr>
+          <w:p>
+            <w:pPr>
+              <w:spacing w:after="20"/>
+            </w:pPr>
+            <w:r>
+              <w:rPr>
+                <w:rFonts w:ascii="TH Sarabun New" w:cs="TH Sarabun New" w:eastAsia="TH Sarabun New" w:hAnsi="TH Sarabun New"/>
+                <w:sz w:val="21"/>
+                <w:szCs w:val="21"/>
+              </w:rPr>
+              <w:t xml:space="preserve">1</w:t>
+            </w:r>
+          </w:p>
+        </w:tc>
+        <w:tc>
+          <w:tcPr>
+            <w:tcW w:type="dxa" w:w="1800"/>
+            <w:tcMar>
+              <w:top w:type="dxa" w:w="70"/>
+              <w:left w:type="dxa" w:w="100"/>
+              <w:bottom w:type="dxa" w:w="70"/>
+              <w:right w:type="dxa" w:w="100"/>
+            </w:tcMar>
+          </w:tcPr>
+          <w:p>
+            <w:pPr>
+              <w:spacing w:after="20"/>
+            </w:pPr>
+            <w:r>
+              <w:rPr>
+                <w:rFonts w:ascii="TH Sarabun New" w:cs="TH Sarabun New" w:eastAsia="TH Sarabun New" w:hAnsi="TH Sarabun New"/>
+                <w:sz w:val="21"/>
+                <w:szCs w:val="21"/>
+              </w:rPr>
+              <w:t xml:space="preserve">75.00</w:t>
+            </w:r>
+          </w:p>
+        </w:tc>
+        <w:tc>
+          <w:tcPr>
+            <w:tcW w:type="dxa" w:w="1800"/>
+            <w:tcMar>
+              <w:top w:type="dxa" w:w="70"/>
+              <w:left w:type="dxa" w:w="100"/>
+              <w:bottom w:type="dxa" w:w="70"/>
+              <w:right w:type="dxa" w:w="100"/>
+            </w:tcMar>
+          </w:tcPr>
+          <w:p>
+            <w:pPr>
+              <w:spacing w:after="20"/>
+            </w:pPr>
+            <w:r>
+              <w:rPr>
+                <w:rFonts w:ascii="TH Sarabun New" w:cs="TH Sarabun New" w:eastAsia="TH Sarabun New" w:hAnsi="TH Sarabun New"/>
+                <w:sz w:val="21"/>
+                <w:szCs w:val="21"/>
+              </w:rPr>
+              <w:t xml:space="preserve">75.00</w:t>
+            </w:r>
+          </w:p>
+        </w:tc>
+      </w:tr>
+      <w:tr>
+        <w:tc>
+          <w:tcPr>
+            <w:tcW w:type="dxa" w:w="4426"/>
+            <w:tcMar>
+              <w:top w:type="dxa" w:w="70"/>
+              <w:left w:type="dxa" w:w="100"/>
+              <w:bottom w:type="dxa" w:w="70"/>
+              <w:right w:type="dxa" w:w="100"/>
+            </w:tcMar>
+          </w:tcPr>
+          <w:p>
+            <w:pPr>
+              <w:spacing w:after="20"/>
+            </w:pPr>
+            <w:r>
+              <w:rPr>
+                <w:rFonts w:ascii="TH Sarabun New" w:cs="TH Sarabun New" w:eastAsia="TH Sarabun New" w:hAnsi="TH Sarabun New"/>
+                <w:sz w:val="21"/>
+                <w:szCs w:val="21"/>
+              </w:rPr>
+              <w:t xml:space="preserve">XL4005 Step Up/Down DC-DC (5-36V→1.2-32V, 5A)</w:t>
+            </w:r>
+          </w:p>
+        </w:tc>
+        <w:tc>
+          <w:tcPr>
+            <w:tcW w:type="dxa" w:w="1000"/>
+            <w:tcMar>
+              <w:top w:type="dxa" w:w="70"/>
+              <w:left w:type="dxa" w:w="100"/>
+              <w:bottom w:type="dxa" w:w="70"/>
+              <w:right w:type="dxa" w:w="100"/>
+            </w:tcMar>
+          </w:tcPr>
+          <w:p>
+            <w:pPr>
+              <w:spacing w:after="20"/>
+            </w:pPr>
+            <w:r>
+              <w:rPr>
+                <w:rFonts w:ascii="TH Sarabun New" w:cs="TH Sarabun New" w:eastAsia="TH Sarabun New" w:hAnsi="TH Sarabun New"/>
+                <w:sz w:val="21"/>
+                <w:szCs w:val="21"/>
+              </w:rPr>
+              <w:t xml:space="preserve">1</w:t>
+            </w:r>
+          </w:p>
+        </w:tc>
+        <w:tc>
+          <w:tcPr>
+            <w:tcW w:type="dxa" w:w="1800"/>
+            <w:tcMar>
+              <w:top w:type="dxa" w:w="70"/>
+              <w:left w:type="dxa" w:w="100"/>
+              <w:bottom w:type="dxa" w:w="70"/>
+              <w:right w:type="dxa" w:w="100"/>
+            </w:tcMar>
+          </w:tcPr>
+          <w:p>
+            <w:pPr>
+              <w:spacing w:after="20"/>
+            </w:pPr>
+            <w:r>
+              <w:rPr>
+                <w:rFonts w:ascii="TH Sarabun New" w:cs="TH Sarabun New" w:eastAsia="TH Sarabun New" w:hAnsi="TH Sarabun New"/>
+                <w:sz w:val="21"/>
+                <w:szCs w:val="21"/>
+              </w:rPr>
+              <w:t xml:space="preserve">180.00</w:t>
+            </w:r>
+          </w:p>
+        </w:tc>
+        <w:tc>
+          <w:tcPr>
+            <w:tcW w:type="dxa" w:w="1800"/>
+            <w:tcMar>
+              <w:top w:type="dxa" w:w="70"/>
+              <w:left w:type="dxa" w:w="100"/>
+              <w:bottom w:type="dxa" w:w="70"/>
+              <w:right w:type="dxa" w:w="100"/>
+            </w:tcMar>
+          </w:tcPr>
+          <w:p>
+            <w:pPr>
+              <w:spacing w:after="20"/>
+            </w:pPr>
+            <w:r>
+              <w:rPr>
+                <w:rFonts w:ascii="TH Sarabun New" w:cs="TH Sarabun New" w:eastAsia="TH Sarabun New" w:hAnsi="TH Sarabun New"/>
+                <w:sz w:val="21"/>
+                <w:szCs w:val="21"/>
+              </w:rPr>
+              <w:t xml:space="preserve">180.00</w:t>
+            </w:r>
+          </w:p>
+        </w:tc>
+      </w:tr>
+      <w:tr>
+        <w:tc>
+          <w:tcPr>
+            <w:tcW w:type="dxa" w:w="4426"/>
+            <w:tcMar>
+              <w:top w:type="dxa" w:w="70"/>
+              <w:left w:type="dxa" w:w="100"/>
+              <w:bottom w:type="dxa" w:w="70"/>
+              <w:right w:type="dxa" w:w="100"/>
+            </w:tcMar>
+          </w:tcPr>
+          <w:p>
+            <w:pPr>
+              <w:spacing w:after="20"/>
+            </w:pPr>
+            <w:r>
+              <w:rPr>
+                <w:rFonts w:ascii="TH Sarabun New" w:cs="TH Sarabun New" w:eastAsia="TH Sarabun New" w:hAnsi="TH Sarabun New"/>
+                <w:sz w:val="21"/>
+                <w:szCs w:val="21"/>
+              </w:rPr>
+              <w:t xml:space="preserve">สาย Jumper</w:t>
+            </w:r>
+          </w:p>
+        </w:tc>
+        <w:tc>
+          <w:tcPr>
+            <w:tcW w:type="dxa" w:w="1000"/>
+            <w:tcMar>
+              <w:top w:type="dxa" w:w="70"/>
+              <w:left w:type="dxa" w:w="100"/>
+              <w:bottom w:type="dxa" w:w="70"/>
+              <w:right w:type="dxa" w:w="100"/>
+            </w:tcMar>
+          </w:tcPr>
+          <w:p>
+            <w:pPr>
+              <w:spacing w:after="20"/>
+            </w:pPr>
+            <w:r>
+              <w:rPr>
+                <w:rFonts w:ascii="TH Sarabun New" w:cs="TH Sarabun New" w:eastAsia="TH Sarabun New" w:hAnsi="TH Sarabun New"/>
+                <w:sz w:val="21"/>
+                <w:szCs w:val="21"/>
+              </w:rPr>
+              <w:t xml:space="preserve">1</w:t>
+            </w:r>
+          </w:p>
+        </w:tc>
+        <w:tc>
+          <w:tcPr>
+            <w:tcW w:type="dxa" w:w="1800"/>
+            <w:tcMar>
+              <w:top w:type="dxa" w:w="70"/>
+              <w:left w:type="dxa" w:w="100"/>
+              <w:bottom w:type="dxa" w:w="70"/>
+              <w:right w:type="dxa" w:w="100"/>
+            </w:tcMar>
+          </w:tcPr>
+          <w:p>
+            <w:pPr>
+              <w:spacing w:after="20"/>
+            </w:pPr>
+            <w:r>
+              <w:rPr>
+                <w:rFonts w:ascii="TH Sarabun New" w:cs="TH Sarabun New" w:eastAsia="TH Sarabun New" w:hAnsi="TH Sarabun New"/>
+                <w:sz w:val="21"/>
+                <w:szCs w:val="21"/>
+              </w:rPr>
+              <w:t xml:space="preserve">300.00</w:t>
+            </w:r>
+          </w:p>
+        </w:tc>
+        <w:tc>
+          <w:tcPr>
+            <w:tcW w:type="dxa" w:w="1800"/>
+            <w:tcMar>
+              <w:top w:type="dxa" w:w="70"/>
+              <w:left w:type="dxa" w:w="100"/>
+              <w:bottom w:type="dxa" w:w="70"/>
+              <w:right w:type="dxa" w:w="100"/>
+            </w:tcMar>
+          </w:tcPr>
+          <w:p>
+            <w:pPr>
+              <w:spacing w:after="20"/>
+            </w:pPr>
+            <w:r>
+              <w:rPr>
+                <w:rFonts w:ascii="TH Sarabun New" w:cs="TH Sarabun New" w:eastAsia="TH Sarabun New" w:hAnsi="TH Sarabun New"/>
+                <w:sz w:val="21"/>
+                <w:szCs w:val="21"/>
+              </w:rPr>
+              <w:t xml:space="preserve">300.00</w:t>
             </w:r>
           </w:p>
         </w:tc>
@@ -7182,7 +8358,7 @@
           <w:sz w:val="24"/>
           <w:szCs w:val="24"/>
         </w:rPr>
-        <w:t xml:space="preserve">รวมตามใบเสนอราคา (เลขที่ QT0165876 ลงวันที่ 15 มิถุนายน 2569): 1,705.00 บาท</w:t>
+        <w:t xml:space="preserve">รวมค่าใช้จ่ายอุปกรณ์ทั้งหมด (อ้างอิงใบเสนอราคาเลขที่ QT0165876 ลงวันที่ 15 มิถุนายน 2569 สำหรับบางรายการ ร่วมกับรายการที่จัดซื้อเพิ่มระหว่างดำเนินงาน): 10,500.50 บาท</w:t>
       </w:r>
     </w:p>
     <w:tbl>
@@ -7238,7 +8414,7 @@
                 <w:sz w:val="23"/>
                 <w:szCs w:val="23"/>
               </w:rPr>
-              <w:t xml:space="preserve">ตัวเลขนี้เป็นเฉพาะรายการที่มีใบเสนอราคาบันทึกไว้ในเอกสารโครงการ ยังไม่รวมค่าใช้จ่ายอื่นที่อาจเกิดขึ้นแยกต่างหาก เช่น บอร์ด ESP32, เซนเซอร์วัดอุณหภูมิ/ความชื้นอากาศ, จอ LCD, Buzzer, หัวพ่นหมอกและสายยาง, กล่องกันน้ำ IP65, และค่าแรงเดินสายไฟ</w:t>
+              <w:t xml:space="preserve">ตัวเลขนี้ครอบคลุมอุปกรณ์หลักที่ใช้งานจริงทั้งหมด รวมรายการที่ไม่มีใบเสนอราคาเป็นทางการ (ประเมินจากราคาตลาดทั่วไป ณ ช่วงเวลาที่จัดซื้อ) ยังไม่รวมค่าแรงเดินสายไฟซึ่งไม่มีการบันทึกราคาแยกไว้</w:t>
             </w:r>
           </w:p>
           <w:p>

</xml_diff>

<commit_message>
docs: fan (CH3) budget line is 2 units, not 1
Combined 4,500 บาท was for 2 fans, not 1 — qty 1->2, unit price
4,500.00->2,250.00. Row total and grand total (10,500.50) unchanged.
</commit_message>
<xml_diff>
--- a/docs/reports/รายงานฉบับสมบูรณ์ - Greenhouse IoT Smart Farm.docx
+++ b/docs/reports/รายงานฉบับสมบูรณ์ - Greenhouse IoT Smart Farm.docx
@@ -7993,7 +7993,7 @@
                 <w:sz w:val="21"/>
                 <w:szCs w:val="21"/>
               </w:rPr>
-              <w:t xml:space="preserve">1</w:t>
+              <w:t xml:space="preserve">2</w:t>
             </w:r>
           </w:p>
         </w:tc>
@@ -8017,7 +8017,7 @@
                 <w:sz w:val="21"/>
                 <w:szCs w:val="21"/>
               </w:rPr>
-              <w:t xml:space="preserve">4,500.00</w:t>
+              <w:t xml:space="preserve">2,250.00</w:t>
             </w:r>
           </w:p>
         </w:tc>

</xml_diff>